<commit_message>
Deploy preview for PR 661 🛫
</commit_message>
<xml_diff>
--- a/pr-preview/pr-661/vignettes/articles/version-crosswalk-1.3-to-1.4.docx
+++ b/pr-preview/pr-661/vignettes/articles/version-crosswalk-1.3-to-1.4.docx
@@ -3049,7 +3049,7 @@
         <w:rPr>
           <w:rStyle w:val="CommentTok"/>
         </w:rPr>
-        <w:t xml:space="preserve">#&gt;     age id    antigen_iso  value</w:t>
+        <w:t xml:space="preserve">#&gt;     age id    antigen_iso value</w:t>
       </w:r>
       <w:r>
         <w:br/>
@@ -3058,7 +3058,7 @@
         <w:rPr>
           <w:rStyle w:val="CommentTok"/>
         </w:rPr>
-        <w:t xml:space="preserve">#&gt;   &lt;dbl&gt; &lt;chr&gt; &lt;chr&gt;        &lt;dbl&gt;</w:t>
+        <w:t xml:space="preserve">#&gt;   &lt;dbl&gt; &lt;chr&gt; &lt;chr&gt;       &lt;dbl&gt;</w:t>
       </w:r>
       <w:r>
         <w:br/>
@@ -3067,7 +3067,7 @@
         <w:rPr>
           <w:rStyle w:val="CommentTok"/>
         </w:rPr>
-        <w:t xml:space="preserve">#&gt; 1 13.3  1     HlyE_IgA    1.48  </w:t>
+        <w:t xml:space="preserve">#&gt; 1 12.1  1     HlyE_IgA    0.627</w:t>
       </w:r>
       <w:r>
         <w:br/>
@@ -3076,7 +3076,7 @@
         <w:rPr>
           <w:rStyle w:val="CommentTok"/>
         </w:rPr>
-        <w:t xml:space="preserve">#&gt; 2 13.3  1     HlyE_IgG    3.06  </w:t>
+        <w:t xml:space="preserve">#&gt; 2 12.1  1     HlyE_IgG    7.79 </w:t>
       </w:r>
       <w:r>
         <w:br/>
@@ -3085,7 +3085,7 @@
         <w:rPr>
           <w:rStyle w:val="CommentTok"/>
         </w:rPr>
-        <w:t xml:space="preserve">#&gt; 3 16.7  2     HlyE_IgA    2.25  </w:t>
+        <w:t xml:space="preserve">#&gt; 3  9.96 2     HlyE_IgA    0.740</w:t>
       </w:r>
       <w:r>
         <w:br/>
@@ -3094,7 +3094,7 @@
         <w:rPr>
           <w:rStyle w:val="CommentTok"/>
         </w:rPr>
-        <w:t xml:space="preserve">#&gt; 4 16.7  2     HlyE_IgG    1.04  </w:t>
+        <w:t xml:space="preserve">#&gt; 4  9.96 2     HlyE_IgG    0.721</w:t>
       </w:r>
       <w:r>
         <w:br/>
@@ -3103,7 +3103,7 @@
         <w:rPr>
           <w:rStyle w:val="CommentTok"/>
         </w:rPr>
-        <w:t xml:space="preserve">#&gt; 5  4.86 3     HlyE_IgA    0.529 </w:t>
+        <w:t xml:space="preserve">#&gt; 5  5.36 3     HlyE_IgA    0.554</w:t>
       </w:r>
       <w:r>
         <w:br/>
@@ -3112,7 +3112,7 @@
         <w:rPr>
           <w:rStyle w:val="CommentTok"/>
         </w:rPr>
-        <w:t xml:space="preserve">#&gt; 6  4.86 3     HlyE_IgG    0.0146</w:t>
+        <w:t xml:space="preserve">#&gt; 6  5.36 3     HlyE_IgG    0.572</w:t>
       </w:r>
       <w:r>
         <w:br/>

</xml_diff>